<commit_message>
rapport vf pour Felix
</commit_message>
<xml_diff>
--- a/rapport/Rapport_IG2405_DeepForm_V2_figures.docx
+++ b/rapport/Rapport_IG2405_DeepForm_V2_figures.docx
@@ -747,29 +747,13 @@
         <w:t xml:space="preserve">Le pipeline complet s’exécute de bout en bout, sans intervention manuelle et sans plantage. </w:t>
       </w:r>
       <w:r>
-        <w:t xml:space="preserve">Sur les trois examens fournis (FORM1, FORM2, FORM3, 130 formulaires), il atteint une </w:t>
-      </w:r>
-      <w:proofErr w:type="spellStart"/>
-      <w:r>
-        <w:t>accuracy</w:t>
-      </w:r>
-      <w:proofErr w:type="spellEnd"/>
-      <w:r>
-        <w:t xml:space="preserve"> globale de 82,7 % par cellule</w:t>
+        <w:t>Sur les trois examens fournis (FORM1, FORM2, FORM3, 130 formulaires), il atteint une accuracy globale de 82,7 % par cellule</w:t>
       </w:r>
       <w:r>
         <w:t>,</w:t>
       </w:r>
       <w:r>
-        <w:t xml:space="preserve"> l'</w:t>
-      </w:r>
-      <w:proofErr w:type="spellStart"/>
-      <w:r>
-        <w:t>accuracy</w:t>
-      </w:r>
-      <w:proofErr w:type="spellEnd"/>
-      <w:r>
-        <w:t xml:space="preserve"> étant calculée en comparant, case par case, les fichiers tableurs produits par le système aux fichiers de vérité terrain fournis, avec des performances contrastées selon la nature de l'information (imprimé 95,1 %, signature 91,5 %, graphique 83,8 %, manuscrit 57,2 %)</w:t>
+        <w:t xml:space="preserve"> l'accuracy étant calculée en comparant, case par case, les fichiers tableurs produits par le système aux fichiers de vérité terrain fournis, avec des performances contrastées selon la nature de l'information (imprimé 95,1 %, signature 91,5 %, graphique 83,8 %, manuscrit 57,2 %)</w:t>
       </w:r>
       <w:r>
         <w:t xml:space="preserve">. Une analyse critique met en évidence les facteurs limitants, difficulté de la reconnaissance d’écriture, faible volume de données annotées, sensibilité de la segmentation, et </w:t>
@@ -2333,13 +2317,8 @@
         <w:jc w:val="both"/>
       </w:pPr>
       <w:r>
-        <w:t xml:space="preserve">La détection du motif en croix érode légèrement la région puis mesure la densité d’encre le long des deux diagonales d₁ et d₂ ; une croix est reconnue si les deux diagonales sont suffisamment </w:t>
-      </w:r>
-      <w:proofErr w:type="gramStart"/>
-      <w:r>
-        <w:t>marquées:</w:t>
-      </w:r>
-      <w:proofErr w:type="gramEnd"/>
+        <w:t>La détection du motif en croix érode légèrement la région puis mesure la densité d’encre le long des deux diagonales d₁ et d₂ ; une croix est reconnue si les deux diagonales sont suffisamment marquées:</w:t>
+      </w:r>
     </w:p>
     <w:p>
       <w:pPr>
@@ -2873,15 +2852,7 @@
         <w:t>aux petits défauts du scan</w:t>
       </w:r>
       <w:r>
-        <w:t xml:space="preserve"> et aux échanges de pages annoncés pour le </w:t>
-      </w:r>
-      <w:proofErr w:type="gramStart"/>
-      <w:r>
-        <w:t>challenge</w:t>
-      </w:r>
-      <w:proofErr w:type="gramEnd"/>
-      <w:r>
-        <w:t>. D’une part, l’ordre des pages d’examen est contrôlé en lisant le numéro de page imprimé (OCR, traitement de texte autorisé) : si tous les numéros sont lus et forment une permutation réellement désordonnée, les pages sont réordonnées avant lecture, sinon l’ordre d’origine est conservé. D’autre part, le comptage des questions distingue une vraie question, porteuse d’un en-tête « QUESTION N » de densité d’encre suffisante juste sous sa ligne supérieure, d’un pied de page (numéro, cryptogramme, équerres) où cette zone est vide, ce qui évite qu’un pied de page ne décale toute la numérotation des réponses.</w:t>
+        <w:t xml:space="preserve"> et aux échanges de pages annoncés pour le challenge. D’une part, l’ordre des pages d’examen est contrôlé en lisant le numéro de page imprimé (OCR, traitement de texte autorisé) : si tous les numéros sont lus et forment une permutation réellement désordonnée, les pages sont réordonnées avant lecture, sinon l’ordre d’origine est conservé. D’autre part, le comptage des questions distingue une vraie question, porteuse d’un en-tête « QUESTION N » de densité d’encre suffisante juste sous sa ligne supérieure, d’un pied de page (numéro, cryptogramme, équerres) où cette zone est vide, ce qui évite qu’un pied de page ne décale toute la numérotation des réponses.</w:t>
       </w:r>
     </w:p>
     <w:p>
@@ -3725,10 +3696,17 @@
     </w:p>
     <w:p>
       <w:pPr>
+        <w:spacing w:before="80" w:after="120"/>
+        <w:jc w:val="center"/>
+      </w:pPr>
+    </w:p>
+    <w:p>
+      <w:pPr>
         <w:pStyle w:val="Titre3"/>
         <w:spacing w:after="90"/>
       </w:pPr>
       <w:r>
+        <w:lastRenderedPageBreak/>
         <w:t>Apprentissage</w:t>
       </w:r>
     </w:p>
@@ -3738,7 +3716,6 @@
         <w:jc w:val="both"/>
       </w:pPr>
       <w:r>
-        <w:lastRenderedPageBreak/>
         <w:t>Chaque réseau est entraîné sur la base EMNIST (variante letters pour 26 classes, digits pour 10 classes), en respectant la méthodologie imposée de séparation en trois bases distinctes : une base d’apprentissage, une base de validation (suivi de la généralisation et sauvegarde du meilleur modèle) et une base de test indépendante pour l’évaluation finale. L’optimisation minimise l’entropie croisée par l’algorithme Adam (taux d’apprentissage 10⁻³) :</w:t>
       </w:r>
     </w:p>
@@ -3857,14 +3834,10 @@
         <w:t xml:space="preserve">Pour réduire l’écart de domaine entre EMNIST et l’écriture réelle des formulaires, chaque réseau est </w:t>
       </w:r>
       <w:r>
-        <w:rPr>
-          <w:b/>
-          <w:bCs/>
-        </w:rPr>
-        <w:t>affiné par apprentissage par transfert</w:t>
-      </w:r>
-      <w:r>
-        <w:t xml:space="preserve"> sur un jeu construit à partir des vérités terrain : les prénoms et noms étant connus, on apparie chaque case non vide à sa lettre lorsque la suite de cases pleines correspond exactement au nom (les noms composés, sources d’étiquettes décalées, sont écartés). On obtient ainsi </w:t>
+        <w:t xml:space="preserve">affiné par apprentissage par transfert </w:t>
+      </w:r>
+      <w:r>
+        <w:t xml:space="preserve">sur un jeu construit à partir des vérités terrain : les prénoms et noms étant connus, on apparie chaque case non vide à sa lettre lorsque la suite de cases pleines correspond exactement au nom (les noms composés, sources d’étiquettes décalées, sont écartés). On obtient ainsi </w:t>
       </w:r>
       <w:r>
         <w:rPr>
@@ -3989,8 +3962,6 @@
       <w:pPr>
         <w:spacing w:before="40" w:after="220"/>
         <w:jc w:val="center"/>
-      </w:pPr>
-      <w:r>
         <w:rPr>
           <w:i/>
           <w:iCs/>
@@ -3998,8 +3969,36 @@
           <w:sz w:val="18"/>
           <w:szCs w:val="18"/>
         </w:rPr>
+      </w:pPr>
+      <w:r>
+        <w:rPr>
+          <w:i/>
+          <w:iCs/>
+          <w:color w:val="595959"/>
+          <w:sz w:val="18"/>
+          <w:szCs w:val="18"/>
+        </w:rPr>
         <w:t>Figure 17 : Découpage bas niveau des cases de caractères manuscrits (prénom, nom). La projection verticale du trait fait ressortir les séparateurs (seuil en rouge), isolant chaque case avant reconnaissance par le CNN.</w:t>
       </w:r>
+    </w:p>
+    <w:p>
+      <w:pPr>
+        <w:spacing w:before="40" w:after="220"/>
+        <w:jc w:val="center"/>
+        <w:rPr>
+          <w:i/>
+          <w:iCs/>
+          <w:color w:val="595959"/>
+          <w:sz w:val="18"/>
+          <w:szCs w:val="18"/>
+        </w:rPr>
+      </w:pPr>
+    </w:p>
+    <w:p>
+      <w:pPr>
+        <w:spacing w:before="40" w:after="220"/>
+        <w:jc w:val="center"/>
+      </w:pPr>
     </w:p>
     <w:p>
       <w:pPr>
@@ -4007,6 +4006,7 @@
         <w:spacing w:after="90"/>
       </w:pPr>
       <w:r>
+        <w:lastRenderedPageBreak/>
         <w:t>Segmentation amont (bas niveau)</w:t>
       </w:r>
     </w:p>
@@ -4016,11 +4016,19 @@
         <w:jc w:val="both"/>
       </w:pPr>
       <w:r>
-        <w:t xml:space="preserve">En amont du réseau, l’isolement des caractères reste de bas niveau : analyse de composantes connexes, une composante étant retenue comme chiffre si sa hauteur est proche de la plus grande </w:t>
-      </w:r>
-      <w:r>
-        <w:lastRenderedPageBreak/>
-        <w:t>composante de la case ; le séparateur décimal est identifié comme une composante petite, étroite et située dans la moitié basse de la case (un point se pose sur la ligne de base). La case de l’exposant, écrit en superscript, donc nettement plus haut que la mantisse et l’unité, est localisée par sa position verticale (propriété structurelle du formulaire) plutôt que par un seuil d’aire fragile. Une garde de « case vide » (taux d’encre, hors cadre, inférieur à 1 %) empêche le réseau de produire des chiffres parasites dans une case non renseignée, correctif déterminant pour éviter qu’un exposant absent ne soit « halluciné ». La Figure 18 illustre cette segmentation et les imagettes 28 × 28 produites en entrée du CNN.</w:t>
+        <w:t>En amont du réseau, l’isolement des caractères reste de bas niveau : analyse de composantes connexes, une composante étant retenue comme chiffre si sa hauteur est proche de la plus grande composante de la case ; le séparateur décimal est identifié comme une composante petite, étroite et située dans la moitié basse de la case (un point se pose sur la ligne de base). La case de l’exposant, écrit en superscript</w:t>
+      </w:r>
+      <w:r>
+        <w:t xml:space="preserve"> (</w:t>
+      </w:r>
+      <w:r>
+        <w:t>exposant</w:t>
+      </w:r>
+      <w:r>
+        <w:t>)</w:t>
+      </w:r>
+      <w:r>
+        <w:t>, donc nettement plus haut que la mantisse et l’unité, est localisée par sa position verticale (propriété structurelle du formulaire) plutôt que par un seuil d’aire fragile. Une garde de « case vide » (taux d’encre, hors cadre, inférieur à 1 %) empêche le réseau de produire des chiffres parasites dans une case non renseignée, correctif déterminant pour éviter qu’un exposant absent ne soit « halluciné ». La Figure 18 illustre cette segmentation et les imagettes 28 × 28 produites en entrée du CNN.</w:t>
       </w:r>
     </w:p>
     <w:p>
@@ -4132,7 +4140,13 @@
         <w:t>utils/config.py</w:t>
       </w:r>
       <w:r>
-        <w:t>) plutôt que codés en dur de façon dispersée, afin d’être ajustés et justifiés aisément. Les principaux sont rassemblés dans le Tableau 1.</w:t>
+        <w:t xml:space="preserve">) plutôt que codés en dur de façon dispersée, afin d’être ajustés et justifiés </w:t>
+      </w:r>
+      <w:r>
+        <w:t>facilement</w:t>
+      </w:r>
+      <w:r>
+        <w:t>. Les principaux sont rassemblés dans le Tableau 1.</w:t>
       </w:r>
     </w:p>
     <w:tbl>
@@ -4820,6 +4834,7 @@
                 <w:sz w:val="19"/>
                 <w:szCs w:val="19"/>
               </w:rPr>
+              <w:lastRenderedPageBreak/>
               <w:t>Signature</w:t>
             </w:r>
           </w:p>
@@ -4978,7 +4993,6 @@
                 <w:sz w:val="19"/>
                 <w:szCs w:val="19"/>
               </w:rPr>
-              <w:lastRenderedPageBreak/>
               <w:t>CNN (affinage)</w:t>
             </w:r>
           </w:p>
@@ -5086,7 +5100,13 @@
         <w:t>validation croisée 5-fold par scripteur</w:t>
       </w:r>
       <w:r>
-        <w:t xml:space="preserve"> (GroupKFold) : toutes les écritures d’un même étudiant restent dans le même pli, de sorte que le score reflète la lecture d’écritures jamais vues, sans fuite optimiste (le réseau ne peut pas « reconnaître la personne » plutôt que la lettre).</w:t>
+        <w:t xml:space="preserve"> (GroupKFold) : toutes les écritures d’un même étudiant restent dans le même pli, de sorte que le score reflète la lecture d’écritures jamais vues, sans fuite optimiste (le réseau ne peut pas « reconnaître l</w:t>
+      </w:r>
+      <w:r>
+        <w:t>’écriture de la</w:t>
+      </w:r>
+      <w:r>
+        <w:t xml:space="preserve"> personne » plutôt que la lettre).</w:t>
       </w:r>
     </w:p>
     <w:p>
@@ -6609,8 +6629,38 @@
         <w:jc w:val="both"/>
       </w:pPr>
       <w:r>
-        <w:t>Les CNN de caractères atteignent environ 86-87 % en validation croisée par scripteur, alors que la lecture manuscrite de bout en bout des formulaires plafonne à 57,2 %. L’écart s’explique non par le classifieur mais par la chaîne autour du réseau (segmentation des cases, détection du séparateur décimal, gestion des cases vides, localisation de la case exposant) et par l’écart de domaine entre EMNIST et l’écriture réelle. Les correctifs apportés, affinage par transfert, recadrage vertical de la bande de lettres, détection du point décimal par sa position basse, garde anti-parasite sur les cases vides, sélection de l’exposant par sa position verticale, ont fait progresser cet axe de façon décisive (le champ Nom passe de 46 % à 68,5 %, l’exposant de 39,3 % à 53,5 %). Il reste néanmoins l’axe le plus difficile, ce qui est conforme à la littérature : la reconnaissance d’écriture libre, sur peu de données annotées et déséquilibrées, est intrinsèquement ardue.</w:t>
-      </w:r>
+        <w:t xml:space="preserve">Les CNN de caractères atteignent environ 86-87 % en validation croisée par scripteur, alors que la lecture manuscrite de bout en bout des formulaires plafonne à 57,2 %. L’écart s’explique non par le classifieur mais par la chaîne autour du réseau (segmentation des cases, détection du séparateur décimal, gestion des cases vides, localisation de la case exposant) et par l’écart de domaine entre EMNIST et l’écriture réelle. Les correctifs apportés, affinage par transfert, recadrage vertical de la bande de lettres, détection du point décimal par sa position basse, garde anti-parasite sur les cases vides, sélection de l’exposant par sa position verticale, ont fait progresser cet axe de façon décisive (le champ Nom passe de 46 % à 68,5 %, l’exposant de 39,3 % à 53,5 %). Il reste néanmoins l’axe le plus difficile, ce qui est conforme à la littérature : la reconnaissance d’écriture libre, sur peu de données annotées et déséquilibrées, </w:t>
+      </w:r>
+      <w:r>
+        <w:t>est difficile par nature</w:t>
+      </w:r>
+      <w:r>
+        <w:t>.</w:t>
+      </w:r>
+    </w:p>
+    <w:p>
+      <w:pPr>
+        <w:spacing w:after="120" w:line="276" w:lineRule="auto"/>
+        <w:jc w:val="both"/>
+      </w:pPr>
+    </w:p>
+    <w:p>
+      <w:pPr>
+        <w:spacing w:after="120" w:line="276" w:lineRule="auto"/>
+        <w:jc w:val="both"/>
+      </w:pPr>
+    </w:p>
+    <w:p>
+      <w:pPr>
+        <w:spacing w:after="120" w:line="276" w:lineRule="auto"/>
+        <w:jc w:val="both"/>
+      </w:pPr>
+    </w:p>
+    <w:p>
+      <w:pPr>
+        <w:spacing w:after="120" w:line="276" w:lineRule="auto"/>
+        <w:jc w:val="both"/>
+      </w:pPr>
     </w:p>
     <w:p>
       <w:pPr>
@@ -6618,6 +6668,7 @@
         <w:spacing w:after="110"/>
       </w:pPr>
       <w:r>
+        <w:lastRenderedPageBreak/>
         <w:t>5.2. Un résultat négatif instructif : l’invariance au seuil de détection des cases</w:t>
       </w:r>
     </w:p>
@@ -6648,11 +6699,7 @@
         <w:t>localisation</w:t>
       </w:r>
       <w:r>
-        <w:t xml:space="preserve"> des cases ; il oriente les travaux futurs vers l’amélioration de la segmentation plutôt </w:t>
-      </w:r>
-      <w:r>
-        <w:lastRenderedPageBreak/>
-        <w:t>que vers le réglage du seuil. C’est précisément le type d’enseignement que permet une démarche expérimentale rigoureuse.</w:t>
+        <w:t xml:space="preserve"> des cases ; il oriente les travaux futurs vers l’amélioration de la segmentation plutôt que vers le réglage du seuil. C’est précisément le type d’enseignement que permet une démarche expérimentale rigoureuse.</w:t>
       </w:r>
     </w:p>
     <w:p>
@@ -6728,6 +6775,7 @@
         <w:jc w:val="both"/>
       </w:pPr>
       <w:r>
+        <w:lastRenderedPageBreak/>
         <w:t>Renforcer la lecture de l’exposant et de l’unité, qui restent les champs manuscrits les plus faibles (53,5 % et 45,5 %), par davantage de données annotées et une augmentation de données ciblée.</w:t>
       </w:r>
     </w:p>
@@ -6742,7 +6790,7 @@
         <w:jc w:val="both"/>
       </w:pPr>
       <w:r>
-        <w:t>Améliorer la localisation des cases de QCM (segmentation et appariement des cases aux lettres), levier identifié comme déterminant par le balayage de seuil.</w:t>
+        <w:t>Rééquilibrer et augmenter le jeu de lettres (classes rares F, Q, V, W, X, Z) pour relever l’exactitude du manuscrit.</w:t>
       </w:r>
     </w:p>
     <w:p>
@@ -6756,36 +6804,16 @@
         <w:jc w:val="both"/>
       </w:pPr>
       <w:r>
-        <w:lastRenderedPageBreak/>
-        <w:t>Rééquilibrer et augmenter le jeu de lettres (classes rares F, Q, V, W, X, Z) pour relever l’exactitude du manuscrit.</w:t>
-      </w:r>
-    </w:p>
-    <w:p>
-      <w:pPr>
-        <w:pStyle w:val="Paragraphedeliste"/>
-        <w:numPr>
-          <w:ilvl w:val="0"/>
-          <w:numId w:val="2"/>
-        </w:numPr>
-        <w:spacing w:after="80" w:line="276" w:lineRule="auto"/>
-        <w:jc w:val="both"/>
-      </w:pPr>
-      <w:r>
-        <w:t>Traiter les quelques PDF sous-comptés lorsqu’un séparateur horizontal pâle manquant fait fusionner deux questions et décale les réponses.</w:t>
-      </w:r>
-    </w:p>
-    <w:p>
-      <w:pPr>
-        <w:pStyle w:val="Paragraphedeliste"/>
-        <w:numPr>
-          <w:ilvl w:val="0"/>
-          <w:numId w:val="2"/>
-        </w:numPr>
-        <w:spacing w:after="80" w:line="276" w:lineRule="auto"/>
-        <w:jc w:val="both"/>
-      </w:pPr>
-      <w:r>
-        <w:t>Renforcer la robustesse de la vérification de signature face aux faux habiles : les scores authentiques et imposteurs se chevauchent partiellement avec un descripteur de bas niveau, plafond raisonnable qu’un apprentissage métrique dédié pourrait dépasser.</w:t>
+        <w:t xml:space="preserve">Renforcer la robustesse de la vérification de signature </w:t>
+      </w:r>
+      <w:r>
+        <w:t>face aux fraudeurs habiles</w:t>
+      </w:r>
+      <w:r>
+        <w:t xml:space="preserve"> </w:t>
+      </w:r>
+      <w:r>
+        <w:t>: les scores authentiques et imposteurs se chevauchent partiellement avec un descripteur de bas niveau, plafond raisonnable qu’un apprentissage métrique dédié pourrait dépasser.</w:t>
       </w:r>
     </w:p>
     <w:p>
@@ -6933,25 +6961,7 @@
         <w:sz w:val="16"/>
         <w:szCs w:val="16"/>
       </w:rPr>
-      <w:t>Lecture automatique de formulaires semi-</w:t>
-    </w:r>
-    <w:proofErr w:type="gramStart"/>
-    <w:r>
-      <w:rPr>
-        <w:color w:val="595959"/>
-        <w:sz w:val="16"/>
-        <w:szCs w:val="16"/>
-      </w:rPr>
-      <w:t>structurés  •</w:t>
-    </w:r>
-    <w:proofErr w:type="gramEnd"/>
-    <w:r>
-      <w:rPr>
-        <w:color w:val="595959"/>
-        <w:sz w:val="16"/>
-        <w:szCs w:val="16"/>
-      </w:rPr>
-      <w:t xml:space="preserve">  </w:t>
+      <w:t xml:space="preserve">Lecture automatique de formulaires semi-structurés  •  </w:t>
     </w:r>
     <w:r>
       <w:rPr>
@@ -7032,18 +7042,8 @@
         <w:sz w:val="16"/>
         <w:szCs w:val="16"/>
       </w:rPr>
-      <w:t xml:space="preserve">Projet IG.2405 - </w:t>
+      <w:t>Projet IG.2405 - DeepForm</w:t>
     </w:r>
-    <w:proofErr w:type="spellStart"/>
-    <w:r>
-      <w:rPr>
-        <w:color w:val="595959"/>
-        <w:sz w:val="16"/>
-        <w:szCs w:val="16"/>
-      </w:rPr>
-      <w:t>DeepForm</w:t>
-    </w:r>
-    <w:proofErr w:type="spellEnd"/>
   </w:p>
 </w:hdr>
 </file>

</xml_diff>